<commit_message>
Compatibilidad: soporte de multiples actividades generales con giros por actividad; anuncios y comercio con validaciones y coordenadas
</commit_message>
<xml_diff>
--- a/plantilla_compa/compatibilidad_indeterminada.docx
+++ b/plantilla_compa/compatibilidad_indeterminada.docx
@@ -1360,6 +1360,7 @@
     </w:p>
     <w:p>
       <w:pPr>
+        <w:pStyle w:val="Prrafodelista"/>
         <w:spacing w:after="0"/>
         <w:jc w:val="both"/>
         <w:rPr>
@@ -1393,7 +1394,104 @@
           <w:tcPr>
             <w:tcW w:w="5069" w:type="dxa"/>
             <w:gridSpan w:val="2"/>
+            <w:tcBorders>
+              <w:top w:val="single" w:sz="4" w:space="0" w:color="auto"/>
+              <w:left w:val="single" w:sz="4" w:space="0" w:color="auto"/>
+              <w:bottom w:val="single" w:sz="4" w:space="0" w:color="auto"/>
+              <w:right w:val="single" w:sz="4" w:space="0" w:color="auto"/>
+            </w:tcBorders>
             <w:vAlign w:val="center"/>
+            <w:hideMark/>
+          </w:tcPr>
+          <w:p>
+            <w:pPr>
+              <w:jc w:val="center"/>
+              <w:rPr>
+                <w:rFonts w:ascii="Calibri" w:hAnsi="Calibri" w:cs="Calibri"/>
+                <w:sz w:val="18"/>
+                <w:szCs w:val="18"/>
+                <w:lang w:val="es-ES"/>
+              </w:rPr>
+            </w:pPr>
+            <w:r>
+              <w:rPr>
+                <w:rFonts w:ascii="Calibri" w:hAnsi="Calibri" w:cs="Calibri"/>
+                <w:sz w:val="18"/>
+                <w:szCs w:val="18"/>
+                <w:lang w:val="es-ES"/>
+              </w:rPr>
+              <w:t>{% for ag in actividades_generales %}</w:t>
+            </w:r>
+          </w:p>
+        </w:tc>
+        <w:tc>
+          <w:tcPr>
+            <w:tcW w:w="1956" w:type="dxa"/>
+            <w:tcBorders>
+              <w:top w:val="single" w:sz="4" w:space="0" w:color="auto"/>
+              <w:left w:val="single" w:sz="4" w:space="0" w:color="auto"/>
+              <w:bottom w:val="single" w:sz="4" w:space="0" w:color="auto"/>
+              <w:right w:val="single" w:sz="4" w:space="0" w:color="auto"/>
+            </w:tcBorders>
+            <w:vAlign w:val="center"/>
+          </w:tcPr>
+          <w:p>
+            <w:pPr>
+              <w:jc w:val="center"/>
+              <w:rPr>
+                <w:rFonts w:ascii="Calibri" w:hAnsi="Calibri" w:cs="Calibri"/>
+                <w:b/>
+                <w:bCs/>
+                <w:sz w:val="18"/>
+                <w:szCs w:val="18"/>
+                <w:lang w:val="es-ES"/>
+              </w:rPr>
+            </w:pPr>
+          </w:p>
+        </w:tc>
+        <w:tc>
+          <w:tcPr>
+            <w:tcW w:w="2496" w:type="dxa"/>
+            <w:gridSpan w:val="2"/>
+            <w:tcBorders>
+              <w:top w:val="single" w:sz="4" w:space="0" w:color="auto"/>
+              <w:left w:val="single" w:sz="4" w:space="0" w:color="auto"/>
+              <w:bottom w:val="single" w:sz="4" w:space="0" w:color="auto"/>
+              <w:right w:val="single" w:sz="4" w:space="0" w:color="auto"/>
+            </w:tcBorders>
+            <w:vAlign w:val="center"/>
+          </w:tcPr>
+          <w:p>
+            <w:pPr>
+              <w:jc w:val="center"/>
+              <w:rPr>
+                <w:rFonts w:ascii="Calibri" w:hAnsi="Calibri" w:cs="Calibri"/>
+                <w:b/>
+                <w:bCs/>
+                <w:sz w:val="18"/>
+                <w:szCs w:val="18"/>
+                <w:lang w:val="es-ES"/>
+              </w:rPr>
+            </w:pPr>
+          </w:p>
+        </w:tc>
+      </w:tr>
+      <w:tr>
+        <w:trPr>
+          <w:trHeight w:val="414"/>
+        </w:trPr>
+        <w:tc>
+          <w:tcPr>
+            <w:tcW w:w="5069" w:type="dxa"/>
+            <w:gridSpan w:val="2"/>
+            <w:tcBorders>
+              <w:top w:val="single" w:sz="4" w:space="0" w:color="auto"/>
+              <w:left w:val="single" w:sz="4" w:space="0" w:color="auto"/>
+              <w:bottom w:val="single" w:sz="4" w:space="0" w:color="auto"/>
+              <w:right w:val="single" w:sz="4" w:space="0" w:color="auto"/>
+            </w:tcBorders>
+            <w:vAlign w:val="center"/>
+            <w:hideMark/>
           </w:tcPr>
           <w:p>
             <w:pPr>
@@ -1425,40 +1523,7 @@
                 <w:szCs w:val="18"/>
                 <w:lang w:val="es-ES"/>
               </w:rPr>
-              <w:t>{{actividad}}</w:t>
-            </w:r>
-            <w:r>
-              <w:rPr>
-                <w:rFonts w:ascii="Calibri" w:hAnsi="Calibri" w:cs="Calibri"/>
-                <w:b/>
-                <w:bCs/>
-                <w:sz w:val="18"/>
-                <w:szCs w:val="18"/>
-                <w:lang w:val="es-ES"/>
-              </w:rPr>
-              <w:t>(</w:t>
-            </w:r>
-            <w:r>
-              <w:rPr>
-                <w:rFonts w:ascii="Calibri" w:hAnsi="Calibri" w:cs="Calibri"/>
-                <w:b/>
-                <w:bCs/>
-                <w:sz w:val="18"/>
-                <w:szCs w:val="18"/>
-                <w:lang w:val="es-ES"/>
-              </w:rPr>
-              <w:t>{{codigo}}</w:t>
-            </w:r>
-            <w:r>
-              <w:rPr>
-                <w:rFonts w:ascii="Calibri" w:hAnsi="Calibri" w:cs="Calibri"/>
-                <w:b/>
-                <w:bCs/>
-                <w:sz w:val="18"/>
-                <w:szCs w:val="18"/>
-                <w:lang w:val="es-ES"/>
-              </w:rPr>
-              <w:t>)</w:t>
+              <w:t>{{ag.actividad}} ({{ag.codigo}})</w:t>
             </w:r>
           </w:p>
         </w:tc>
@@ -1466,7 +1531,14 @@
           <w:tcPr>
             <w:tcW w:w="1956" w:type="dxa"/>
             <w:vMerge w:val="restart"/>
+            <w:tcBorders>
+              <w:top w:val="single" w:sz="4" w:space="0" w:color="auto"/>
+              <w:left w:val="single" w:sz="4" w:space="0" w:color="auto"/>
+              <w:bottom w:val="single" w:sz="4" w:space="0" w:color="auto"/>
+              <w:right w:val="single" w:sz="4" w:space="0" w:color="auto"/>
+            </w:tcBorders>
             <w:vAlign w:val="center"/>
+            <w:hideMark/>
           </w:tcPr>
           <w:p>
             <w:pPr>
@@ -1489,29 +1561,7 @@
                 <w:szCs w:val="18"/>
                 <w:lang w:val="es-ES"/>
               </w:rPr>
-              <w:t>ZONIFICACI</w:t>
-            </w:r>
-            <w:r>
-              <w:rPr>
-                <w:rFonts w:ascii="Calibri" w:hAnsi="Calibri" w:cs="Calibri"/>
-                <w:b/>
-                <w:bCs/>
-                <w:sz w:val="18"/>
-                <w:szCs w:val="18"/>
-                <w:lang w:val="es-ES"/>
-              </w:rPr>
-              <w:t>Ó</w:t>
-            </w:r>
-            <w:r>
-              <w:rPr>
-                <w:rFonts w:ascii="Calibri" w:hAnsi="Calibri" w:cs="Calibri"/>
-                <w:b/>
-                <w:bCs/>
-                <w:sz w:val="18"/>
-                <w:szCs w:val="18"/>
-                <w:lang w:val="es-ES"/>
-              </w:rPr>
-              <w:t>N</w:t>
+              <w:t>ZONIFICACIÓN</w:t>
             </w:r>
           </w:p>
         </w:tc>
@@ -1519,7 +1569,14 @@
           <w:tcPr>
             <w:tcW w:w="2496" w:type="dxa"/>
             <w:gridSpan w:val="2"/>
+            <w:tcBorders>
+              <w:top w:val="single" w:sz="4" w:space="0" w:color="auto"/>
+              <w:left w:val="single" w:sz="4" w:space="0" w:color="auto"/>
+              <w:bottom w:val="single" w:sz="4" w:space="0" w:color="auto"/>
+              <w:right w:val="single" w:sz="4" w:space="0" w:color="auto"/>
+            </w:tcBorders>
             <w:vAlign w:val="center"/>
+            <w:hideMark/>
           </w:tcPr>
           <w:p>
             <w:pPr>
@@ -1554,7 +1611,14 @@
         <w:tc>
           <w:tcPr>
             <w:tcW w:w="2534" w:type="dxa"/>
+            <w:tcBorders>
+              <w:top w:val="single" w:sz="4" w:space="0" w:color="auto"/>
+              <w:left w:val="single" w:sz="4" w:space="0" w:color="auto"/>
+              <w:bottom w:val="single" w:sz="4" w:space="0" w:color="auto"/>
+              <w:right w:val="single" w:sz="4" w:space="0" w:color="auto"/>
+            </w:tcBorders>
             <w:vAlign w:val="center"/>
+            <w:hideMark/>
           </w:tcPr>
           <w:p>
             <w:pPr>
@@ -1573,32 +1637,21 @@
                 <w:szCs w:val="18"/>
                 <w:lang w:val="es-ES"/>
               </w:rPr>
-              <w:t>C</w:t>
-            </w:r>
-            <w:r>
-              <w:rPr>
-                <w:rFonts w:ascii="Calibri" w:hAnsi="Calibri" w:cs="Calibri"/>
-                <w:sz w:val="18"/>
-                <w:szCs w:val="18"/>
-                <w:lang w:val="es-ES"/>
-              </w:rPr>
-              <w:t>Ó</w:t>
-            </w:r>
-            <w:r>
-              <w:rPr>
-                <w:rFonts w:ascii="Calibri" w:hAnsi="Calibri" w:cs="Calibri"/>
-                <w:sz w:val="18"/>
-                <w:szCs w:val="18"/>
-                <w:lang w:val="es-ES"/>
-              </w:rPr>
-              <w:t>DIGO</w:t>
+              <w:t>CÓDIGO</w:t>
             </w:r>
           </w:p>
         </w:tc>
         <w:tc>
           <w:tcPr>
             <w:tcW w:w="2535" w:type="dxa"/>
+            <w:tcBorders>
+              <w:top w:val="single" w:sz="4" w:space="0" w:color="auto"/>
+              <w:left w:val="single" w:sz="4" w:space="0" w:color="auto"/>
+              <w:bottom w:val="single" w:sz="4" w:space="0" w:color="auto"/>
+              <w:right w:val="single" w:sz="4" w:space="0" w:color="auto"/>
+            </w:tcBorders>
             <w:vAlign w:val="center"/>
+            <w:hideMark/>
           </w:tcPr>
           <w:p>
             <w:pPr>
@@ -1623,13 +1676,19 @@
         </w:tc>
         <w:tc>
           <w:tcPr>
-            <w:tcW w:w="1956" w:type="dxa"/>
+            <w:tcW w:w="0" w:type="auto"/>
             <w:vMerge/>
+            <w:tcBorders>
+              <w:top w:val="single" w:sz="4" w:space="0" w:color="auto"/>
+              <w:left w:val="single" w:sz="4" w:space="0" w:color="auto"/>
+              <w:bottom w:val="single" w:sz="4" w:space="0" w:color="auto"/>
+              <w:right w:val="single" w:sz="4" w:space="0" w:color="auto"/>
+            </w:tcBorders>
             <w:vAlign w:val="center"/>
+            <w:hideMark/>
           </w:tcPr>
           <w:p>
             <w:pPr>
-              <w:jc w:val="center"/>
               <w:rPr>
                 <w:rFonts w:ascii="Calibri" w:hAnsi="Calibri" w:cs="Calibri"/>
                 <w:b/>
@@ -1644,7 +1703,14 @@
         <w:tc>
           <w:tcPr>
             <w:tcW w:w="1216" w:type="dxa"/>
+            <w:tcBorders>
+              <w:top w:val="single" w:sz="4" w:space="0" w:color="auto"/>
+              <w:left w:val="single" w:sz="4" w:space="0" w:color="auto"/>
+              <w:bottom w:val="single" w:sz="4" w:space="0" w:color="auto"/>
+              <w:right w:val="single" w:sz="4" w:space="0" w:color="auto"/>
+            </w:tcBorders>
             <w:vAlign w:val="center"/>
+            <w:hideMark/>
           </w:tcPr>
           <w:p>
             <w:pPr>
@@ -1672,7 +1738,14 @@
         <w:tc>
           <w:tcPr>
             <w:tcW w:w="1280" w:type="dxa"/>
+            <w:tcBorders>
+              <w:top w:val="single" w:sz="4" w:space="0" w:color="auto"/>
+              <w:left w:val="single" w:sz="4" w:space="0" w:color="auto"/>
+              <w:bottom w:val="single" w:sz="4" w:space="0" w:color="auto"/>
+              <w:right w:val="single" w:sz="4" w:space="0" w:color="auto"/>
+            </w:tcBorders>
             <w:vAlign w:val="center"/>
+            <w:hideMark/>
           </w:tcPr>
           <w:p>
             <w:pPr>
@@ -1705,7 +1778,14 @@
         <w:tc>
           <w:tcPr>
             <w:tcW w:w="2534" w:type="dxa"/>
+            <w:tcBorders>
+              <w:top w:val="single" w:sz="4" w:space="0" w:color="auto"/>
+              <w:left w:val="single" w:sz="4" w:space="0" w:color="auto"/>
+              <w:bottom w:val="single" w:sz="4" w:space="0" w:color="auto"/>
+              <w:right w:val="single" w:sz="4" w:space="0" w:color="auto"/>
+            </w:tcBorders>
             <w:vAlign w:val="center"/>
+            <w:hideMark/>
           </w:tcPr>
           <w:p>
             <w:pPr>
@@ -1724,13 +1804,19 @@
                 <w:szCs w:val="18"/>
                 <w:lang w:val="es-ES"/>
               </w:rPr>
-              <w:t>{%tr for fila in actividades_tabla %}</w:t>
+              <w:t>{% for fila in ag.giros %}</w:t>
             </w:r>
           </w:p>
         </w:tc>
         <w:tc>
           <w:tcPr>
             <w:tcW w:w="2535" w:type="dxa"/>
+            <w:tcBorders>
+              <w:top w:val="single" w:sz="4" w:space="0" w:color="auto"/>
+              <w:left w:val="single" w:sz="4" w:space="0" w:color="auto"/>
+              <w:bottom w:val="single" w:sz="4" w:space="0" w:color="auto"/>
+              <w:right w:val="single" w:sz="4" w:space="0" w:color="auto"/>
+            </w:tcBorders>
             <w:vAlign w:val="center"/>
           </w:tcPr>
           <w:p>
@@ -1748,6 +1834,12 @@
         <w:tc>
           <w:tcPr>
             <w:tcW w:w="1956" w:type="dxa"/>
+            <w:tcBorders>
+              <w:top w:val="single" w:sz="4" w:space="0" w:color="auto"/>
+              <w:left w:val="single" w:sz="4" w:space="0" w:color="auto"/>
+              <w:bottom w:val="single" w:sz="4" w:space="0" w:color="auto"/>
+              <w:right w:val="single" w:sz="4" w:space="0" w:color="auto"/>
+            </w:tcBorders>
             <w:vAlign w:val="center"/>
           </w:tcPr>
           <w:p>
@@ -1767,6 +1859,12 @@
         <w:tc>
           <w:tcPr>
             <w:tcW w:w="1216" w:type="dxa"/>
+            <w:tcBorders>
+              <w:top w:val="single" w:sz="4" w:space="0" w:color="auto"/>
+              <w:left w:val="single" w:sz="4" w:space="0" w:color="auto"/>
+              <w:bottom w:val="single" w:sz="4" w:space="0" w:color="auto"/>
+              <w:right w:val="single" w:sz="4" w:space="0" w:color="auto"/>
+            </w:tcBorders>
             <w:vAlign w:val="center"/>
           </w:tcPr>
           <w:p>
@@ -1786,6 +1884,12 @@
         <w:tc>
           <w:tcPr>
             <w:tcW w:w="1280" w:type="dxa"/>
+            <w:tcBorders>
+              <w:top w:val="single" w:sz="4" w:space="0" w:color="auto"/>
+              <w:left w:val="single" w:sz="4" w:space="0" w:color="auto"/>
+              <w:bottom w:val="single" w:sz="4" w:space="0" w:color="auto"/>
+              <w:right w:val="single" w:sz="4" w:space="0" w:color="auto"/>
+            </w:tcBorders>
             <w:vAlign w:val="center"/>
           </w:tcPr>
           <w:p>
@@ -1810,7 +1914,14 @@
         <w:tc>
           <w:tcPr>
             <w:tcW w:w="2534" w:type="dxa"/>
+            <w:tcBorders>
+              <w:top w:val="single" w:sz="4" w:space="0" w:color="auto"/>
+              <w:left w:val="single" w:sz="4" w:space="0" w:color="auto"/>
+              <w:bottom w:val="single" w:sz="4" w:space="0" w:color="auto"/>
+              <w:right w:val="single" w:sz="4" w:space="0" w:color="auto"/>
+            </w:tcBorders>
             <w:vAlign w:val="center"/>
+            <w:hideMark/>
           </w:tcPr>
           <w:p>
             <w:pPr>
@@ -1830,7 +1941,14 @@
         <w:tc>
           <w:tcPr>
             <w:tcW w:w="2535" w:type="dxa"/>
+            <w:tcBorders>
+              <w:top w:val="single" w:sz="4" w:space="0" w:color="auto"/>
+              <w:left w:val="single" w:sz="4" w:space="0" w:color="auto"/>
+              <w:bottom w:val="single" w:sz="4" w:space="0" w:color="auto"/>
+              <w:right w:val="single" w:sz="4" w:space="0" w:color="auto"/>
+            </w:tcBorders>
             <w:vAlign w:val="center"/>
+            <w:hideMark/>
           </w:tcPr>
           <w:p>
             <w:pPr>
@@ -1856,7 +1974,14 @@
         <w:tc>
           <w:tcPr>
             <w:tcW w:w="1956" w:type="dxa"/>
+            <w:tcBorders>
+              <w:top w:val="single" w:sz="4" w:space="0" w:color="auto"/>
+              <w:left w:val="single" w:sz="4" w:space="0" w:color="auto"/>
+              <w:bottom w:val="single" w:sz="4" w:space="0" w:color="auto"/>
+              <w:right w:val="single" w:sz="4" w:space="0" w:color="auto"/>
+            </w:tcBorders>
             <w:vAlign w:val="center"/>
+            <w:hideMark/>
           </w:tcPr>
           <w:p>
             <w:pPr>
@@ -1879,7 +2004,7 @@
                 <w:szCs w:val="24"/>
                 <w:lang w:val="es-ES"/>
               </w:rPr>
-              <w:t>{{zona}}</w:t>
+              <w:t>{{ag.zona}}</w:t>
             </w:r>
           </w:p>
           <w:p>
@@ -1903,14 +2028,21 @@
                 <w:szCs w:val="18"/>
                 <w:lang w:val="es-ES"/>
               </w:rPr>
-              <w:t>{{ zona_desc }}</w:t>
+              <w:t>{{ ag.zona_desc }}</w:t>
             </w:r>
           </w:p>
         </w:tc>
         <w:tc>
           <w:tcPr>
             <w:tcW w:w="1216" w:type="dxa"/>
+            <w:tcBorders>
+              <w:top w:val="single" w:sz="4" w:space="0" w:color="auto"/>
+              <w:left w:val="single" w:sz="4" w:space="0" w:color="auto"/>
+              <w:bottom w:val="single" w:sz="4" w:space="0" w:color="auto"/>
+              <w:right w:val="single" w:sz="4" w:space="0" w:color="auto"/>
+            </w:tcBorders>
             <w:vAlign w:val="center"/>
+            <w:hideMark/>
           </w:tcPr>
           <w:p>
             <w:pPr>
@@ -1940,7 +2072,14 @@
         <w:tc>
           <w:tcPr>
             <w:tcW w:w="1280" w:type="dxa"/>
+            <w:tcBorders>
+              <w:top w:val="single" w:sz="4" w:space="0" w:color="auto"/>
+              <w:left w:val="single" w:sz="4" w:space="0" w:color="auto"/>
+              <w:bottom w:val="single" w:sz="4" w:space="0" w:color="auto"/>
+              <w:right w:val="single" w:sz="4" w:space="0" w:color="auto"/>
+            </w:tcBorders>
             <w:vAlign w:val="center"/>
+            <w:hideMark/>
           </w:tcPr>
           <w:p>
             <w:pPr>
@@ -1975,7 +2114,14 @@
         <w:tc>
           <w:tcPr>
             <w:tcW w:w="2534" w:type="dxa"/>
+            <w:tcBorders>
+              <w:top w:val="single" w:sz="4" w:space="0" w:color="auto"/>
+              <w:left w:val="single" w:sz="4" w:space="0" w:color="auto"/>
+              <w:bottom w:val="single" w:sz="4" w:space="0" w:color="auto"/>
+              <w:right w:val="single" w:sz="4" w:space="0" w:color="auto"/>
+            </w:tcBorders>
             <w:vAlign w:val="center"/>
+            <w:hideMark/>
           </w:tcPr>
           <w:p>
             <w:pPr>
@@ -1994,13 +2140,19 @@
                 <w:szCs w:val="18"/>
                 <w:lang w:val="es-ES"/>
               </w:rPr>
-              <w:t>{%tr endfor %}</w:t>
+              <w:t>{% endfor %}</w:t>
             </w:r>
           </w:p>
         </w:tc>
         <w:tc>
           <w:tcPr>
             <w:tcW w:w="2535" w:type="dxa"/>
+            <w:tcBorders>
+              <w:top w:val="single" w:sz="4" w:space="0" w:color="auto"/>
+              <w:left w:val="single" w:sz="4" w:space="0" w:color="auto"/>
+              <w:bottom w:val="single" w:sz="4" w:space="0" w:color="auto"/>
+              <w:right w:val="single" w:sz="4" w:space="0" w:color="auto"/>
+            </w:tcBorders>
             <w:vAlign w:val="center"/>
           </w:tcPr>
           <w:p>
@@ -2018,6 +2170,12 @@
         <w:tc>
           <w:tcPr>
             <w:tcW w:w="1956" w:type="dxa"/>
+            <w:tcBorders>
+              <w:top w:val="single" w:sz="4" w:space="0" w:color="auto"/>
+              <w:left w:val="single" w:sz="4" w:space="0" w:color="auto"/>
+              <w:bottom w:val="single" w:sz="4" w:space="0" w:color="auto"/>
+              <w:right w:val="single" w:sz="4" w:space="0" w:color="auto"/>
+            </w:tcBorders>
             <w:vAlign w:val="center"/>
           </w:tcPr>
           <w:p>
@@ -2037,6 +2195,12 @@
         <w:tc>
           <w:tcPr>
             <w:tcW w:w="1216" w:type="dxa"/>
+            <w:tcBorders>
+              <w:top w:val="single" w:sz="4" w:space="0" w:color="auto"/>
+              <w:left w:val="single" w:sz="4" w:space="0" w:color="auto"/>
+              <w:bottom w:val="single" w:sz="4" w:space="0" w:color="auto"/>
+              <w:right w:val="single" w:sz="4" w:space="0" w:color="auto"/>
+            </w:tcBorders>
             <w:vAlign w:val="center"/>
           </w:tcPr>
           <w:p>
@@ -2056,6 +2220,148 @@
         <w:tc>
           <w:tcPr>
             <w:tcW w:w="1280" w:type="dxa"/>
+            <w:tcBorders>
+              <w:top w:val="single" w:sz="4" w:space="0" w:color="auto"/>
+              <w:left w:val="single" w:sz="4" w:space="0" w:color="auto"/>
+              <w:bottom w:val="single" w:sz="4" w:space="0" w:color="auto"/>
+              <w:right w:val="single" w:sz="4" w:space="0" w:color="auto"/>
+            </w:tcBorders>
+            <w:vAlign w:val="center"/>
+          </w:tcPr>
+          <w:p>
+            <w:pPr>
+              <w:jc w:val="center"/>
+              <w:rPr>
+                <w:rFonts w:ascii="Calibri" w:hAnsi="Calibri" w:cs="Calibri"/>
+                <w:b/>
+                <w:bCs/>
+                <w:sz w:val="18"/>
+                <w:szCs w:val="18"/>
+                <w:lang w:val="es-ES"/>
+              </w:rPr>
+            </w:pPr>
+          </w:p>
+        </w:tc>
+      </w:tr>
+      <w:tr>
+        <w:trPr>
+          <w:trHeight w:val="421"/>
+        </w:trPr>
+        <w:tc>
+          <w:tcPr>
+            <w:tcW w:w="2534" w:type="dxa"/>
+            <w:tcBorders>
+              <w:top w:val="single" w:sz="4" w:space="0" w:color="auto"/>
+              <w:left w:val="single" w:sz="4" w:space="0" w:color="auto"/>
+              <w:bottom w:val="single" w:sz="4" w:space="0" w:color="auto"/>
+              <w:right w:val="single" w:sz="4" w:space="0" w:color="auto"/>
+            </w:tcBorders>
+            <w:vAlign w:val="center"/>
+            <w:hideMark/>
+          </w:tcPr>
+          <w:p>
+            <w:pPr>
+              <w:jc w:val="center"/>
+              <w:rPr>
+                <w:rFonts w:ascii="Calibri" w:hAnsi="Calibri" w:cs="Calibri"/>
+                <w:sz w:val="18"/>
+                <w:szCs w:val="18"/>
+                <w:lang w:val="es-ES"/>
+              </w:rPr>
+            </w:pPr>
+            <w:r>
+              <w:rPr>
+                <w:rFonts w:ascii="Calibri" w:hAnsi="Calibri" w:cs="Calibri"/>
+                <w:sz w:val="18"/>
+                <w:szCs w:val="18"/>
+                <w:lang w:val="es-ES"/>
+              </w:rPr>
+              <w:t>{% endfor %}</w:t>
+            </w:r>
+          </w:p>
+        </w:tc>
+        <w:tc>
+          <w:tcPr>
+            <w:tcW w:w="2535" w:type="dxa"/>
+            <w:tcBorders>
+              <w:top w:val="single" w:sz="4" w:space="0" w:color="auto"/>
+              <w:left w:val="single" w:sz="4" w:space="0" w:color="auto"/>
+              <w:bottom w:val="single" w:sz="4" w:space="0" w:color="auto"/>
+              <w:right w:val="single" w:sz="4" w:space="0" w:color="auto"/>
+            </w:tcBorders>
+            <w:vAlign w:val="center"/>
+          </w:tcPr>
+          <w:p>
+            <w:pPr>
+              <w:jc w:val="center"/>
+              <w:rPr>
+                <w:rFonts w:ascii="Calibri" w:hAnsi="Calibri" w:cs="Calibri"/>
+                <w:sz w:val="18"/>
+                <w:szCs w:val="18"/>
+                <w:lang w:val="es-ES"/>
+              </w:rPr>
+            </w:pPr>
+          </w:p>
+        </w:tc>
+        <w:tc>
+          <w:tcPr>
+            <w:tcW w:w="1956" w:type="dxa"/>
+            <w:tcBorders>
+              <w:top w:val="single" w:sz="4" w:space="0" w:color="auto"/>
+              <w:left w:val="single" w:sz="4" w:space="0" w:color="auto"/>
+              <w:bottom w:val="single" w:sz="4" w:space="0" w:color="auto"/>
+              <w:right w:val="single" w:sz="4" w:space="0" w:color="auto"/>
+            </w:tcBorders>
+            <w:vAlign w:val="center"/>
+          </w:tcPr>
+          <w:p>
+            <w:pPr>
+              <w:jc w:val="center"/>
+              <w:rPr>
+                <w:rFonts w:ascii="Calibri" w:hAnsi="Calibri" w:cs="Calibri"/>
+                <w:b/>
+                <w:bCs/>
+                <w:sz w:val="24"/>
+                <w:szCs w:val="24"/>
+                <w:lang w:val="es-ES"/>
+              </w:rPr>
+            </w:pPr>
+          </w:p>
+        </w:tc>
+        <w:tc>
+          <w:tcPr>
+            <w:tcW w:w="1216" w:type="dxa"/>
+            <w:tcBorders>
+              <w:top w:val="single" w:sz="4" w:space="0" w:color="auto"/>
+              <w:left w:val="single" w:sz="4" w:space="0" w:color="auto"/>
+              <w:bottom w:val="single" w:sz="4" w:space="0" w:color="auto"/>
+              <w:right w:val="single" w:sz="4" w:space="0" w:color="auto"/>
+            </w:tcBorders>
+            <w:vAlign w:val="center"/>
+          </w:tcPr>
+          <w:p>
+            <w:pPr>
+              <w:jc w:val="center"/>
+              <w:rPr>
+                <w:rFonts w:ascii="Calibri" w:hAnsi="Calibri" w:cs="Calibri"/>
+                <w:b/>
+                <w:bCs/>
+                <w:sz w:val="18"/>
+                <w:szCs w:val="18"/>
+                <w:lang w:val="es-ES"/>
+              </w:rPr>
+            </w:pPr>
+          </w:p>
+        </w:tc>
+        <w:tc>
+          <w:tcPr>
+            <w:tcW w:w="1280" w:type="dxa"/>
+            <w:tcBorders>
+              <w:top w:val="single" w:sz="4" w:space="0" w:color="auto"/>
+              <w:left w:val="single" w:sz="4" w:space="0" w:color="auto"/>
+              <w:bottom w:val="single" w:sz="4" w:space="0" w:color="auto"/>
+              <w:right w:val="single" w:sz="4" w:space="0" w:color="auto"/>
+            </w:tcBorders>
             <w:vAlign w:val="center"/>
           </w:tcPr>
           <w:p>
@@ -2167,17 +2473,8 @@
           <w:szCs w:val="20"/>
           <w:lang w:val="es-ES"/>
         </w:rPr>
-        <w:t xml:space="preserve">De acuerdo a reajuste integral de zonificación del sector Manchay del distrito de Pachacamac y parte de la cuenca baja del rio Lurín, aprobada a través de la Ordenanza 2236-MML, Ordenanza 2561-MML y la numeración de índices de usos correspondientes a la Ordenanza 933-MML, se determina que el (los) </w:t>
-      </w:r>
-      <w:r>
-        <w:rPr>
-          <w:rFonts w:ascii="Calibri" w:hAnsi="Calibri" w:cs="Calibri"/>
-          <w:sz w:val="20"/>
-          <w:szCs w:val="20"/>
-          <w:lang w:val="es-ES"/>
-        </w:rPr>
         <w:lastRenderedPageBreak/>
-        <w:t>giros comerciales solicitados por el administrado,</w:t>
+        <w:t>De acuerdo a reajuste integral de zonificación del sector Manchay del distrito de Pachacamac y parte de la cuenca baja del rio Lurín, aprobada a través de la Ordenanza 2236-MML, Ordenanza 2561-MML y la numeración de índices de usos correspondientes a la Ordenanza 933-MML, se determina que el (los) giros comerciales solicitados por el administrado,</w:t>
       </w:r>
       <w:r>
         <w:rPr>
@@ -2589,7 +2886,7 @@
                     </wp:anchor>
                   </w:drawing>
                 </mc:Choice>
-                <mc:Fallback xmlns:w16du="http://schemas.microsoft.com/office/word/2023/wordml/word16du" xmlns:oel="http://schemas.microsoft.com/office/2019/extlst">
+                <mc:Fallback xmlns:oel="http://schemas.microsoft.com/office/2019/extlst" xmlns:w16du="http://schemas.microsoft.com/office/word/2023/wordml/word16du">
                   <w:pict>
                     <v:oval w14:anchorId="487FE29A" id="Elipse 3" o:spid="_x0000_s1026" style="position:absolute;margin-left:35.8pt;margin-top:4.45pt;width:67.05pt;height:64.65pt;z-index:251707392;visibility:visible;mso-wrap-style:square;mso-width-percent:0;mso-height-percent:0;mso-wrap-distance-left:9pt;mso-wrap-distance-top:0;mso-wrap-distance-right:9pt;mso-wrap-distance-bottom:0;mso-position-horizontal:absolute;mso-position-horizontal-relative:text;mso-position-vertical:absolute;mso-position-vertical-relative:text;mso-width-percent:0;mso-height-percent:0;mso-width-relative:margin;mso-height-relative:margin;v-text-anchor:middle" o:gfxdata="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" filled="f" strokecolor="black [3213]" strokeweight="1.5pt">
                       <v:stroke joinstyle="miter"/>
@@ -2711,7 +3008,7 @@
                     </wp:anchor>
                   </w:drawing>
                 </mc:Choice>
-                <mc:Fallback xmlns:w16du="http://schemas.microsoft.com/office/word/2023/wordml/word16du" xmlns:oel="http://schemas.microsoft.com/office/2019/extlst">
+                <mc:Fallback xmlns:oel="http://schemas.microsoft.com/office/2019/extlst" xmlns:w16du="http://schemas.microsoft.com/office/word/2023/wordml/word16du">
                   <w:pict>
                     <v:rect w14:anchorId="44C02F79" id="Rectángulo 4" o:spid="_x0000_s1026" style="position:absolute;margin-left:73pt;margin-top:1.9pt;width:7.45pt;height:8.4pt;rotation:-6142251fd;flip:x y;z-index:251735040;visibility:visible;mso-wrap-style:square;mso-width-percent:0;mso-height-percent:0;mso-wrap-distance-left:9pt;mso-wrap-distance-top:0;mso-wrap-distance-right:9pt;mso-wrap-distance-bottom:0;mso-position-horizontal:absolute;mso-position-horizontal-relative:text;mso-position-vertical:absolute;mso-position-vertical-relative:text;mso-width-percent:0;mso-height-percent:0;mso-width-relative:margin;mso-height-relative:margin;v-text-anchor:middle" o:gfxdata="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" fillcolor="black [3200]" strokecolor="black [480]" strokeweight="1.5pt"/>
                   </w:pict>

</xml_diff>